<commit_message>
Add courthouse-capacity argument as point 1 of the Motion for Video Appearance
The motion body in templates/motion-webex.docx now opens with a new
numbered argument: mass calendaring strains courthouse staff, security
screening, and seating capacity. Existing arguments renumber after it.

Co-Authored-By: Claude Fable 5 <noreply@anthropic.com>
Claude-Session: https://claude.ai/code/session_01Vdp3BXfsLwYZkcBZZdbfNx
</commit_message>
<xml_diff>
--- a/templates/motion-webex.docx
+++ b/templates/motion-webex.docx
@@ -3125,6 +3125,14 @@
       </w:r>
       <w:r>
         <w:t xml:space="preserve"> as follows:</w:t>
+      </w:r>
+    </w:p>
+    <w:p>
+      <w:pPr>
+        <w:pStyle w:val="ListParagraphTRF"/>
+      </w:pPr>
+      <w:r>
+        <w:t>The practice of calendaring an extraordinary number of cases on a single date places severe strain on the physical and operational capacity of the courthouse—taxing available staff, overwhelming security screening and entry, and exceeding the space and seating the facility can reasonably accommodate.</w:t>
       </w:r>
     </w:p>
     <w:p>

</xml_diff>

<commit_message>
Add courthouse-capacity paragraph to the Webex motion body
Insert a new numbered paragraph in templates/motion-webex.docx, after the
efficiency/schedule point and before the EOIR authority point, covering the
strain the consolidated high-volume master calendar puts on the courthouse
(staff, security and entry screening, space and seating) and why those
conditions hamper live testimony and witnesses appearing from abroad.

The paragraph reuses the ListParagraphTRF style of the surrounding items so
it numbers with them, and sits outside every content control, leaving all 13
Field SDTs the generator fills untouched.

Co-Authored-By: Claude Opus 5 <noreply@anthropic.com>
Claude-Session: https://claude.ai/code/session_01HHsjck6fzS2P6aZo3hcpPC
</commit_message>
<xml_diff>
--- a/templates/motion-webex.docx
+++ b/templates/motion-webex.docx
@@ -3179,6 +3179,17 @@
       </w:r>
       <w:r>
         <w:t>llowing Respondent to appear via Webex would facilitate greater efficiency and minimize disruption to her academic schedule, while still ensuring full participation in the proceedings.</w:t>
+      </w:r>
+      <w:r>
+        <w:t xml:space="preserve"> </w:t>
+      </w:r>
+    </w:p>
+    <w:p>
+      <w:pPr>
+        <w:pStyle w:val="ListParagraphTRF"/>
+      </w:pPr>
+      <w:r>
+        <w:t>The current consolidated, high-volume master calendar setting places substantial strain on the courthouse’s operational capacity—available staff, security and entry screening, and physical space and seating. These conditions are not conducive to the careful presentation of live testimony, and they compound the difficulty of accommodating witnesses who must appear from abroad.</w:t>
       </w:r>
       <w:r>
         <w:t xml:space="preserve"> </w:t>

</xml_diff>